<commit_message>
Del 7 Projects och Teamshantering -rikare tickets arbetsflöden
</commit_message>
<xml_diff>
--- a/docs/ProjectAtlas_Systemdokumentation.docx
+++ b/docs/ProjectAtlas_Systemdokumentation.docx
@@ -86,7 +86,7 @@
           <w:sz w:val="20"/>
           <w:szCs w:val="20"/>
         </w:rPr>
-        <w:t xml:space="preserve">Senast uppdaterad: 9 september 2026 — status efter Del 6</w:t>
+        <w:t xml:space="preserve">Senast uppdaterad: 9 september 2026 — status efter Del 7</w:t>
       </w:r>
     </w:p>
     <w:p>
@@ -340,7 +340,7 @@
             <w:r>
               <w:drawing>
                 <wp:inline distT="0" distB="0" distL="0" distR="0">
-                  <wp:extent cx="2286000" cy="7143750"/>
+                  <wp:extent cx="1905000" cy="7143750"/>
                   <wp:effectExtent t="0" r="0" b="0" l="0"/>
                   <wp:docPr id="1" name="" descr="" title=""/>
                   <wp:cNvGraphicFramePr>
@@ -365,7 +365,7 @@
                         <pic:spPr bwMode="auto">
                           <a:xfrm>
                             <a:off x="0" y="0"/>
-                            <a:ext cx="2286000" cy="7143750"/>
+                            <a:ext cx="1905000" cy="7143750"/>
                           </a:xfrm>
                           <a:prstGeom prst="rect">
                             <a:avLst/>
@@ -698,7 +698,7 @@
                 <w:sz w:val="20"/>
                 <w:szCs w:val="20"/>
               </w:rPr>
-              <w:t xml:space="preserve">Lokal JWT-autentisering och permission-baserad auktorisering (Del 5); Organizations- och Users-hantering (Del 6); Projects- och Teams-endpoints samt rikare ticket-arbetsflöden (Del 7, planerat)</w:t>
+              <w:t xml:space="preserve">Lokal JWT-autentisering och permission-baserad auktorisering (Del 5); Organizations- och Users-hantering (Del 6); Projects- och Teams-hantering (Del 7) — klart; rikare ticket-arbetsflöden återstår</w:t>
             </w:r>
           </w:p>
         </w:tc>
@@ -2072,11 +2072,11 @@
               <w:rPr>
                 <w:b/>
                 <w:bCs/>
-                <w:color w:val="8A6D00"/>
-                <w:sz w:val="20"/>
-                <w:szCs w:val="20"/>
-              </w:rPr>
-              <w:t xml:space="preserve">Näst på tur</w:t>
+                <w:color w:val="2E7D32"/>
+                <w:sz w:val="20"/>
+                <w:szCs w:val="20"/>
+              </w:rPr>
+              <w:t xml:space="preserve">Klart</w:t>
             </w:r>
           </w:p>
         </w:tc>
@@ -4031,7 +4031,7 @@
         <w:spacing w:after="160"/>
       </w:pPr>
       <w:r>
-        <w:t xml:space="preserve">Det här avsnittet går igenom Del 1–6 konkret: vad som finns, och varför det ser ut som det gör.</w:t>
+        <w:t xml:space="preserve">Det här avsnittet går igenom Del 1–7 konkret: vad som finns, och varför det ser ut som det gör.</w:t>
       </w:r>
     </w:p>
     <w:p>
@@ -4242,17 +4242,20 @@
       </w:r>
     </w:p>
     <w:p>
-      <w:r>
-        <w:br w:type="page"/>
-      </w:r>
-    </w:p>
-    <w:p>
-      <w:pPr>
-        <w:pStyle w:val="Heading1"/>
-        <w:spacing w:after="200" w:before="400"/>
-      </w:pPr>
-      <w:r>
-        <w:t xml:space="preserve">6. Kom igång</w:t>
+      <w:pPr>
+        <w:pStyle w:val="Heading2"/>
+        <w:spacing w:after="150" w:before="300"/>
+      </w:pPr>
+      <w:r>
+        <w:t xml:space="preserve">5.4 Del 7 — Projects- och Teams-hantering (Fas 2)</w:t>
+      </w:r>
+    </w:p>
+    <w:p>
+      <w:pPr>
+        <w:spacing w:after="160"/>
+      </w:pPr>
+      <w:r>
+        <w:t xml:space="preserve">Del 7 fyller i de sista luckorna i CRUD-täckningen: Project och Team har funnits som domänentiteter (med EF Core-konfiguration och databastabeller) sedan grunden i Fas 1, men hade inga endpoints. Ingen ny migration behövdes — det här är rent applikations- och API-lager ovanpå ett schema som redan fanns.</w:t>
       </w:r>
     </w:p>
     <w:p>
@@ -4265,7 +4268,7 @@
         <w:spacing w:after="100"/>
       </w:pPr>
       <w:r>
-        <w:t xml:space="preserve">Förutsättningar: .NET 10 SDK, en SQL Server-instans (LocalDB, Docker eller Azure SQL), samt dotnet-ef (dotnet tool install --global dotnet-ef).</w:t>
+        <w:t xml:space="preserve">Project.Read/Project.Manage fanns redan definierade i Permissions sedan tidigare, men saknade en controller. Team.Read/Team.Manage är helt nya permissions, introducerade av den här Delen.</w:t>
       </w:r>
     </w:p>
     <w:p>
@@ -4278,7 +4281,7 @@
         <w:spacing w:after="100"/>
       </w:pPr>
       <w:r>
-        <w:t xml:space="preserve">Bygg: dotnet restore och dotnet build från lösningens rot.</w:t>
+        <w:t xml:space="preserve">Både Project.Manage och Team.Manage ligger på samma förtroendenivå som User.Manage (Manager + Admin), inte på Organization.Manage-nivån (endast Admin) — att skapa ett projekt eller ett internt team är vardagsarbete inuti en organisation en Manager redan tillhör, inte en förändring av tenant-gränsen.</w:t>
       </w:r>
     </w:p>
     <w:p>
@@ -4291,7 +4294,7 @@
         <w:spacing w:after="100"/>
       </w:pPr>
       <w:r>
-        <w:t xml:space="preserve">Databas: peka ConnectionStrings:AtlasDb i appsettings.Development.json (eller via dotnet user-secrets) mot en riktig SQL Server-instans.</w:t>
+        <w:t xml:space="preserve">ProjectsController och TeamsController följer exakt samma mönster som OrganizationsController/UsersController: tunna repositories, en service som orkestrerar domänmetoderna (Project.Create/AddMember/Archive, Team.Create/AddMember/RemoveMember), DTO:er för sökning/lista/detalj.</w:t>
       </w:r>
     </w:p>
     <w:p>
@@ -4304,7 +4307,7 @@
         <w:spacing w:after="100"/>
       </w:pPr>
       <w:r>
-        <w:t xml:space="preserve">Första migrationen: från src/Atlas.Api, kör dotnet ef migrations add InitialCreate --project ../Atlas.Infrastructure --startup-project . och sedan dotnet ef database update med samma flaggor.</w:t>
+        <w:t xml:space="preserve">Ett nytt frågemönster jämfört med tidigare Delar: GetMemberCountsAsync gör en enda GROUP BY-fråga för en hel sida med projekt eller team, i stället för en COUNT(*) per rad. Att göra det senare (vilket OrganizationRepository.GetChildCountsAsync gör, fast för en enskild organisation) hade blivit ett klassiskt N+1-problem på en sida med 25 rader.</w:t>
       </w:r>
     </w:p>
     <w:p>
@@ -4317,7 +4320,17 @@
         <w:spacing w:after="100"/>
       </w:pPr>
       <w:r>
-        <w:t xml:space="preserve">Kör API:et: dotnet run --project src/Atlas.Api. Swagger UI öppnas på https://localhost:5081/swagger (eller http://localhost:5080/swagger).</w:t>
+        <w:t xml:space="preserve">Ett medvetet, dokumenterat gap: Project saknar en RemoveMember- och en Unarchive-metod på domännivå (Team har båda, via AddMember/RemoveMember), så ProjectsController exponerar inte det ännu. Det är inte ett förbiseende — kommentarerna i koden förklarar varför, och lösningen är att lägga till metoden på domänentiteten Project först, eftersom det är domänen som äger regeln.</w:t>
+      </w:r>
+    </w:p>
+    <w:p>
+      <w:pPr>
+        <w:pStyle w:val="Heading1"/>
+        <w:pageBreakBefore/>
+        <w:spacing w:after="200" w:before="400"/>
+      </w:pPr>
+      <w:r>
+        <w:t xml:space="preserve">6. Kom igång</w:t>
       </w:r>
     </w:p>
     <w:p>
@@ -4330,37 +4343,7 @@
         <w:spacing w:after="100"/>
       </w:pPr>
       <w:r>
-        <w:t xml:space="preserve">Testa: registrera en användare (POST /api/auth/register — kräver ett giltigt organizationId, se bootstrap-anmärkningen i avsnitt 5.3), logga in, och använd token:en i Swagger UI:s Authorize-knapp eller som en Authorization: Bearer-header med curl.</w:t>
-      </w:r>
-    </w:p>
-    <w:p>
-      <w:pPr>
-        <w:spacing w:after="160"/>
-      </w:pPr>
-      <w:r>
-        <w:t xml:space="preserve">Fullständiga curl-exempel för samtliga endpoints (tickets, organizations, users) finns i README.md under “Try it”.</w:t>
-      </w:r>
-    </w:p>
-    <w:p>
-      <w:r>
-        <w:br w:type="page"/>
-      </w:r>
-    </w:p>
-    <w:p>
-      <w:pPr>
-        <w:pStyle w:val="Heading1"/>
-        <w:spacing w:after="200" w:before="400"/>
-      </w:pPr>
-      <w:r>
-        <w:t xml:space="preserve">7. Kända förenklingar och teknisk skuld</w:t>
-      </w:r>
-    </w:p>
-    <w:p>
-      <w:pPr>
-        <w:spacing w:after="160"/>
-      </w:pPr>
-      <w:r>
-        <w:t xml:space="preserve">Medvetna genvägar som finns kvar just nu, och när de är tänkta att åtgärdas:</w:t>
+        <w:t xml:space="preserve">Förutsättningar: .NET 10 SDK, en SQL Server-instans (LocalDB, Docker eller Azure SQL), samt dotnet-ef (dotnet tool install --global dotnet-ef).</w:t>
       </w:r>
     </w:p>
     <w:p>
@@ -4373,7 +4356,7 @@
         <w:spacing w:after="100"/>
       </w:pPr>
       <w:r>
-        <w:t xml:space="preserve">Ingen token-återkallelse eller refresh-token-flöde: JWT:er är giltiga tills de går ut naturligt (Jwt:ExpiryMinutes). En inaktiverad användares befintliga token fortsätter alltså fungera fram till förfallotid — en roll- eller statusändring slår igenom först vid nästa inloggning.</w:t>
+        <w:t xml:space="preserve">Bygg: dotnet restore och dotnet build från lösningens rot.</w:t>
       </w:r>
     </w:p>
     <w:p>
@@ -4386,7 +4369,7 @@
         <w:spacing w:after="100"/>
       </w:pPr>
       <w:r>
-        <w:t xml:space="preserve">Självregistrering (POST /api/auth/register) tillåter den som registrerar sig att välja vilken roll som helst, inklusive Admin, och vilket befintligt organizationId som helst. Ett medvetet dev/demo-bekvämlighet som en riktig driftsättning skulle ersätta med ett inbjudningsflöde eller en standardroll (Customer).</w:t>
+        <w:t xml:space="preserve">Databas: peka ConnectionStrings:AtlasDb i appsettings.Development.json (eller via dotnet user-secrets) mot en riktig SQL Server-instans.</w:t>
       </w:r>
     </w:p>
     <w:p>
@@ -4399,7 +4382,7 @@
         <w:spacing w:after="100"/>
       </w:pPr>
       <w:r>
-        <w:t xml:space="preserve">AuditLog- och Notification-tabellerna finns i schemat, men inget skriver till dem ännu — de kopplas in i senare faser (Service Bus-konsumenter respektive bakgrundsworkern för försenade ärenden).</w:t>
+        <w:t xml:space="preserve">Första migrationen: från src/Atlas.Api, kör dotnet ef migrations add InitialCreate --project ../Atlas.Infrastructure --startup-project . och sedan dotnet ef database update med samma flaggor.</w:t>
       </w:r>
     </w:p>
     <w:p>
@@ -4412,7 +4395,7 @@
         <w:spacing w:after="100"/>
       </w:pPr>
       <w:r>
-        <w:t xml:space="preserve">Attachment.BlobName är i dagsläget bara en textkolumn; ingen uppladdningsendpoint finns än. Azure Blob Storage och uppladdningsflödet är planerat till Fas 3.</w:t>
+        <w:t xml:space="preserve">Kör API:et: dotnet run --project src/Atlas.Api. Swagger UI öppnas på https://localhost:5081/swagger (eller http://localhost:5080/swagger).</w:t>
       </w:r>
     </w:p>
     <w:p>
@@ -4425,7 +4408,15 @@
         <w:spacing w:after="100"/>
       </w:pPr>
       <w:r>
-        <w:t xml:space="preserve">Anslutningssträngar och JWT-signeringsnyckeln ligger i appsettings.Development.json / user-secrets för lokal utveckling. I Azure ersätts detta av Key Vault och DefaultAzureCredential — inga hemligheter i App Service-konfigurationen.</w:t>
+        <w:t xml:space="preserve">Testa: registrera en användare (POST /api/auth/register — kräver ett giltigt organizationId, se bootstrap-anmärkningen i avsnitt 5.3), logga in, och använd token:en i Swagger UI:s Authorize-knapp eller som en Authorization: Bearer-header med curl.</w:t>
+      </w:r>
+    </w:p>
+    <w:p>
+      <w:pPr>
+        <w:spacing w:after="160"/>
+      </w:pPr>
+      <w:r>
+        <w:t xml:space="preserve">Fullständiga curl-exempel för samtliga endpoints (tickets, organizations, users) finns i README.md under “Try it”.</w:t>
       </w:r>
     </w:p>
     <w:p>
@@ -4439,6 +4430,93 @@
         <w:spacing w:after="200" w:before="400"/>
       </w:pPr>
       <w:r>
+        <w:t xml:space="preserve">7. Kända förenklingar och teknisk skuld</w:t>
+      </w:r>
+    </w:p>
+    <w:p>
+      <w:pPr>
+        <w:spacing w:after="160"/>
+      </w:pPr>
+      <w:r>
+        <w:t xml:space="preserve">Medvetna genvägar som finns kvar just nu, och när de är tänkta att åtgärdas:</w:t>
+      </w:r>
+    </w:p>
+    <w:p>
+      <w:pPr>
+        <w:pStyle w:val="ListParagraph"/>
+        <w:numPr>
+          <w:ilvl w:val="0"/>
+          <w:numId w:val="2"/>
+        </w:numPr>
+        <w:spacing w:after="100"/>
+      </w:pPr>
+      <w:r>
+        <w:t xml:space="preserve">Ingen token-återkallelse eller refresh-token-flöde: JWT:er är giltiga tills de går ut naturligt (Jwt:ExpiryMinutes). En inaktiverad användares befintliga token fortsätter alltså fungera fram till förfallotid — en roll- eller statusändring slår igenom först vid nästa inloggning.</w:t>
+      </w:r>
+    </w:p>
+    <w:p>
+      <w:pPr>
+        <w:pStyle w:val="ListParagraph"/>
+        <w:numPr>
+          <w:ilvl w:val="0"/>
+          <w:numId w:val="2"/>
+        </w:numPr>
+        <w:spacing w:after="100"/>
+      </w:pPr>
+      <w:r>
+        <w:t xml:space="preserve">Självregistrering (POST /api/auth/register) tillåter den som registrerar sig att välja vilken roll som helst, inklusive Admin, och vilket befintligt organizationId som helst. Ett medvetet dev/demo-bekvämlighet som en riktig driftsättning skulle ersätta med ett inbjudningsflöde eller en standardroll (Customer).</w:t>
+      </w:r>
+    </w:p>
+    <w:p>
+      <w:pPr>
+        <w:pStyle w:val="ListParagraph"/>
+        <w:numPr>
+          <w:ilvl w:val="0"/>
+          <w:numId w:val="2"/>
+        </w:numPr>
+        <w:spacing w:after="100"/>
+      </w:pPr>
+      <w:r>
+        <w:t xml:space="preserve">AuditLog- och Notification-tabellerna finns i schemat, men inget skriver till dem ännu — de kopplas in i senare faser (Service Bus-konsumenter respektive bakgrundsworkern för försenade ärenden).</w:t>
+      </w:r>
+    </w:p>
+    <w:p>
+      <w:pPr>
+        <w:pStyle w:val="ListParagraph"/>
+        <w:numPr>
+          <w:ilvl w:val="0"/>
+          <w:numId w:val="2"/>
+        </w:numPr>
+        <w:spacing w:after="100"/>
+      </w:pPr>
+      <w:r>
+        <w:t xml:space="preserve">Attachment.BlobName är i dagsläget bara en textkolumn; ingen uppladdningsendpoint finns än. Azure Blob Storage och uppladdningsflödet är planerat till Fas 3.</w:t>
+      </w:r>
+    </w:p>
+    <w:p>
+      <w:pPr>
+        <w:pStyle w:val="ListParagraph"/>
+        <w:numPr>
+          <w:ilvl w:val="0"/>
+          <w:numId w:val="2"/>
+        </w:numPr>
+        <w:spacing w:after="100"/>
+      </w:pPr>
+      <w:r>
+        <w:t xml:space="preserve">Anslutningssträngar och JWT-signeringsnyckeln ligger i appsettings.Development.json / user-secrets för lokal utveckling. I Azure ersätts detta av Key Vault och DefaultAzureCredential — inga hemligheter i App Service-konfigurationen.</w:t>
+      </w:r>
+    </w:p>
+    <w:p>
+      <w:r>
+        <w:br w:type="page"/>
+      </w:r>
+    </w:p>
+    <w:p>
+      <w:pPr>
+        <w:pStyle w:val="Heading1"/>
+        <w:spacing w:after="200" w:before="400"/>
+      </w:pPr>
+      <w:r>
         <w:t xml:space="preserve">8. Nästa steg</w:t>
       </w:r>
     </w:p>
@@ -4447,7 +4525,7 @@
         <w:spacing w:after="160"/>
       </w:pPr>
       <w:r>
-        <w:t xml:space="preserve">Del 7 — Projects- och Teams-hantering — är påbörjad och fyller i de sista luckorna i CRUD-täckningen för domänens huvudaggregat (Organization och User är klara via Del 6; Ticket har varit klart sedan Del 1–4). Det avslutar Fas 2. Därefter tar Fas 3 vid: Del 8 (Azure-driftsättning), Del 9 (Azure SQL), Del 10 (Blob Storage) och Del 20 (Key Vault) — de faktiska Azure-tjänsterna som ersätter den lokala SQL Server-instansen och den lokala JWT-signeringsnyckeln.</w:t>
+        <w:t xml:space="preserve">Del 7 — Projects- och Teams-hantering — är nu klar, vilket täcker CRUD för domänens huvudaggregat (Organization och User via Del 6; Project och Team via Del 7; Ticket sedan Del 1–4). Det som återstår av Fas 2 är rikare ticket-arbetsflöden — allt annat i fasen är på plats. Därefter tar Fas 3 vid: Del 8 (Azure-driftsättning), Del 9 (Azure SQL), Del 10 (Blob Storage) och Del 20 (Key Vault) — de faktiska Azure-tjänsterna som ersätter den lokala SQL Server-instansen och den lokala JWT-signeringsnyckeln.</w:t>
       </w:r>
     </w:p>
     <w:p>

</xml_diff>

<commit_message>
Del 7 Projects och Teamshantering -rikare tickets arbetsflöden Klart Fas 2 Klart
</commit_message>
<xml_diff>
--- a/docs/ProjectAtlas_Systemdokumentation.docx
+++ b/docs/ProjectAtlas_Systemdokumentation.docx
@@ -698,7 +698,7 @@
                 <w:sz w:val="20"/>
                 <w:szCs w:val="20"/>
               </w:rPr>
-              <w:t xml:space="preserve">Lokal JWT-autentisering och permission-baserad auktorisering (Del 5); Organizations- och Users-hantering (Del 6); Projects- och Teams-hantering (Del 7) — klart; rikare ticket-arbetsflöden återstår</w:t>
+              <w:t xml:space="preserve">Lokal JWT-autentisering och permission-baserad auktorisering (Del 5); Organizations- och Users-hantering (Del 6); Projects- och Teams-hantering inklusive rikare ticket-arbetsflöden (Del 7)</w:t>
             </w:r>
           </w:p>
         </w:tc>
@@ -722,11 +722,11 @@
               <w:rPr>
                 <w:b/>
                 <w:bCs/>
-                <w:color w:val="8A6D00"/>
-                <w:sz w:val="20"/>
-                <w:szCs w:val="20"/>
-              </w:rPr>
-              <w:t xml:space="preserve">Pågår</w:t>
+                <w:color w:val="2E7D32"/>
+                <w:sz w:val="20"/>
+                <w:szCs w:val="20"/>
+              </w:rPr>
+              <w:t xml:space="preserve">Klart</w:t>
             </w:r>
           </w:p>
         </w:tc>
@@ -4294,7 +4294,7 @@
         <w:spacing w:after="100"/>
       </w:pPr>
       <w:r>
-        <w:t xml:space="preserve">ProjectsController och TeamsController följer exakt samma mönster som OrganizationsController/UsersController: tunna repositories, en service som orkestrerar domänmetoderna (Project.Create/AddMember/Archive, Team.Create/AddMember/RemoveMember), DTO:er för sökning/lista/detalj.</w:t>
+        <w:t xml:space="preserve">ProjectsController och TeamsController följer exakt samma mönster som OrganizationsController/UsersController: tunna repositories, en service som orkestrerar domänmetoderna (Project.Create/AddMember/RemoveMember/Archive/Unarchive, Team.Create/AddMember/RemoveMember), DTO:er för sökning/lista/detalj.</w:t>
       </w:r>
     </w:p>
     <w:p>
@@ -4320,17 +4320,24 @@
         <w:spacing w:after="100"/>
       </w:pPr>
       <w:r>
-        <w:t xml:space="preserve">Ett medvetet, dokumenterat gap: Project saknar en RemoveMember- och en Unarchive-metod på domännivå (Team har båda, via AddMember/RemoveMember), så ProjectsController exponerar inte det ännu. Det är inte ett förbiseende — kommentarerna i koden förklarar varför, och lösningen är att lägga till metoden på domänentiteten Project först, eftersom det är domänen som äger regeln.</w:t>
-      </w:r>
-    </w:p>
-    <w:p>
-      <w:pPr>
-        <w:pStyle w:val="Heading1"/>
-        <w:pageBreakBefore/>
-        <w:spacing w:after="200" w:before="400"/>
-      </w:pPr>
-      <w:r>
-        <w:t xml:space="preserve">6. Kom igång</w:t>
+        <w:t xml:space="preserve">Del 7 var till en början inte helt symmetrisk: Project saknade en RemoveMember- och en Unarchive-metod som Team redan hade. Det dokumenterades öppet som ett känt gap och stängdes sedan i ett eget litet steg — samma mönster på domän-, applikations- och API-lagret som Team redan använde, plus nya endpoints (POST .../unarchive, DELETE .../members/{userId}) och fyra nya domäntester. Project och Team har nu symmetrisk funktionalitet.</w:t>
+      </w:r>
+    </w:p>
+    <w:p>
+      <w:pPr>
+        <w:pStyle w:val="Heading2"/>
+        <w:spacing w:after="150" w:before="300"/>
+      </w:pPr>
+      <w:r>
+        <w:t xml:space="preserve">5.5 Ticket-arbetsflöden — den sista biten av Fas 2</w:t>
+      </w:r>
+    </w:p>
+    <w:p>
+      <w:pPr>
+        <w:spacing w:after="160"/>
+      </w:pPr>
+      <w:r>
+        <w:t xml:space="preserve">Ticket.Reopen(), Ticket.AddTag() och Ticket.RemoveTag() fanns redan som domänmetoder — de skrevs när Ticket-entiteten själv byggdes i Fas 1, men fick aldrig endpoints kopplade till sig. Det är gammal scope på Ticket, inte en fortsättning på Del 7, och det är därför det stod kvar som en öppen punkt i avsnitt 7 medan Del 5–7 färdigställdes en efter en. Nu är den punkten stängd:</w:t>
       </w:r>
     </w:p>
     <w:p>
@@ -4343,7 +4350,7 @@
         <w:spacing w:after="100"/>
       </w:pPr>
       <w:r>
-        <w:t xml:space="preserve">Förutsättningar: .NET 10 SDK, en SQL Server-instans (LocalDB, Docker eller Azure SQL), samt dotnet-ef (dotnet tool install --global dotnet-ef).</w:t>
+        <w:t xml:space="preserve">POST /api/tickets/{id}/reopen öppnar en Closed- eller Cancelled-ticket igen — samma regel som redan fanns i domänen (Ticket.Reopen kastar DomainException annars), nu bara nåbar via API:et.</w:t>
       </w:r>
     </w:p>
     <w:p>
@@ -4356,7 +4363,7 @@
         <w:spacing w:after="100"/>
       </w:pPr>
       <w:r>
-        <w:t xml:space="preserve">Bygg: dotnet restore och dotnet build från lösningens rot.</w:t>
+        <w:t xml:space="preserve">POST /api/tickets/{id}/tags och POST /api/tickets/{id}/tags/remove tar ett taggnamn i request-body, inte ett tagg-id — anroparen behöver aldrig skapa taggen separat först. GetOrCreateTagAsync slår upp eller skapar taggen (normaliserad exakt som Tag.Create gör: trim + gemener), scopad till ticketens egen organisation. Borttagning gör medvetet inte samma get-or-create — att ta bort en tagg som aldrig fanns är en no-op, inte en anledning att skapa taggen bara för att omedelbart inte använda den.</w:t>
       </w:r>
     </w:p>
     <w:p>
@@ -4369,7 +4376,7 @@
         <w:spacing w:after="100"/>
       </w:pPr>
       <w:r>
-        <w:t xml:space="preserve">Databas: peka ConnectionStrings:AtlasDb i appsettings.Development.json (eller via dotnet user-secrets) mot en riktig SQL Server-instans.</w:t>
+        <w:t xml:space="preserve">TicketListQuery kan nu filtrera på ProjectId (GET /api/tickets?projectId=…), så en vy kan visa "alla ärenden för det här projektet" utan att hämta allt och filtrera i klienten.</w:t>
       </w:r>
     </w:p>
     <w:p>
@@ -4382,7 +4389,7 @@
         <w:spacing w:after="100"/>
       </w:pPr>
       <w:r>
-        <w:t xml:space="preserve">Första migrationen: från src/Atlas.Api, kör dotnet ef migrations add InitialCreate --project ../Atlas.Infrastructure --startup-project . och sedan dotnet ef database update med samma flaggor.</w:t>
+        <w:t xml:space="preserve">DELETE /api/tickets/{id} är en riktig hård borttagning, gated bakom Permissions.TicketDelete (Manager/Admin) — permissionen fanns definierad och testad sedan tidigare men saknade en endpoint helt, ett “dinglande” tillstånd som nu är löst. Cascade delete i TicketConfigurations tar med sig kommentarer, historik, taggar och bilagor. Det är en medveten avvägning: till skillnad från att avsluta ett ärende via status Cancelled (som behåller hela historiken) försvinner revisionsspåret på riktigt vid en hård borttagning — därför den egna, snävare permissionen i stället för den generella Ticket.Update som täcker statusändringar.</w:t>
       </w:r>
     </w:p>
     <w:p>
@@ -4395,7 +4402,17 @@
         <w:spacing w:after="100"/>
       </w:pPr>
       <w:r>
-        <w:t xml:space="preserve">Kör API:et: dotnet run --project src/Atlas.Api. Swagger UI öppnas på https://localhost:5081/swagger (eller http://localhost:5080/swagger).</w:t>
+        <w:t xml:space="preserve">Fyra nya domäntester i TicketTests.cs (AddTag med ny tagg, AddTag två gånger som no-op, RemoveTag på befintlig tagg, RemoveTag på okänd tagg som no-op) täcker taggbeteendet utan databas — Reopen hade redan tester sedan tidigare, eftersom domänregeln inte är ny, bara den nu tillgänglig via API.</w:t>
+      </w:r>
+    </w:p>
+    <w:p>
+      <w:pPr>
+        <w:pStyle w:val="Heading1"/>
+        <w:pageBreakBefore/>
+        <w:spacing w:after="200" w:before="400"/>
+      </w:pPr>
+      <w:r>
+        <w:t xml:space="preserve">6. Kom igång</w:t>
       </w:r>
     </w:p>
     <w:p>
@@ -4408,37 +4425,7 @@
         <w:spacing w:after="100"/>
       </w:pPr>
       <w:r>
-        <w:t xml:space="preserve">Testa: registrera en användare (POST /api/auth/register — kräver ett giltigt organizationId, se bootstrap-anmärkningen i avsnitt 5.3), logga in, och använd token:en i Swagger UI:s Authorize-knapp eller som en Authorization: Bearer-header med curl.</w:t>
-      </w:r>
-    </w:p>
-    <w:p>
-      <w:pPr>
-        <w:spacing w:after="160"/>
-      </w:pPr>
-      <w:r>
-        <w:t xml:space="preserve">Fullständiga curl-exempel för samtliga endpoints (tickets, organizations, users) finns i README.md under “Try it”.</w:t>
-      </w:r>
-    </w:p>
-    <w:p>
-      <w:r>
-        <w:br w:type="page"/>
-      </w:r>
-    </w:p>
-    <w:p>
-      <w:pPr>
-        <w:pStyle w:val="Heading1"/>
-        <w:spacing w:after="200" w:before="400"/>
-      </w:pPr>
-      <w:r>
-        <w:t xml:space="preserve">7. Kända förenklingar och teknisk skuld</w:t>
-      </w:r>
-    </w:p>
-    <w:p>
-      <w:pPr>
-        <w:spacing w:after="160"/>
-      </w:pPr>
-      <w:r>
-        <w:t xml:space="preserve">Medvetna genvägar som finns kvar just nu, och när de är tänkta att åtgärdas:</w:t>
+        <w:t xml:space="preserve">Förutsättningar: .NET 10 SDK, en SQL Server-instans (LocalDB, Docker eller Azure SQL), samt dotnet-ef (dotnet tool install --global dotnet-ef).</w:t>
       </w:r>
     </w:p>
     <w:p>
@@ -4451,7 +4438,7 @@
         <w:spacing w:after="100"/>
       </w:pPr>
       <w:r>
-        <w:t xml:space="preserve">Ingen token-återkallelse eller refresh-token-flöde: JWT:er är giltiga tills de går ut naturligt (Jwt:ExpiryMinutes). En inaktiverad användares befintliga token fortsätter alltså fungera fram till förfallotid — en roll- eller statusändring slår igenom först vid nästa inloggning.</w:t>
+        <w:t xml:space="preserve">Bygg: dotnet restore och dotnet build från lösningens rot.</w:t>
       </w:r>
     </w:p>
     <w:p>
@@ -4464,7 +4451,7 @@
         <w:spacing w:after="100"/>
       </w:pPr>
       <w:r>
-        <w:t xml:space="preserve">Självregistrering (POST /api/auth/register) tillåter den som registrerar sig att välja vilken roll som helst, inklusive Admin, och vilket befintligt organizationId som helst. Ett medvetet dev/demo-bekvämlighet som en riktig driftsättning skulle ersätta med ett inbjudningsflöde eller en standardroll (Customer).</w:t>
+        <w:t xml:space="preserve">Databas: peka ConnectionStrings:AtlasDb i appsettings.Development.json (eller via dotnet user-secrets) mot en riktig SQL Server-instans.</w:t>
       </w:r>
     </w:p>
     <w:p>
@@ -4477,7 +4464,7 @@
         <w:spacing w:after="100"/>
       </w:pPr>
       <w:r>
-        <w:t xml:space="preserve">AuditLog- och Notification-tabellerna finns i schemat, men inget skriver till dem ännu — de kopplas in i senare faser (Service Bus-konsumenter respektive bakgrundsworkern för försenade ärenden).</w:t>
+        <w:t xml:space="preserve">Första migrationen: från src/Atlas.Api, kör dotnet ef migrations add InitialCreate --project ../Atlas.Infrastructure --startup-project . och sedan dotnet ef database update med samma flaggor.</w:t>
       </w:r>
     </w:p>
     <w:p>
@@ -4490,7 +4477,7 @@
         <w:spacing w:after="100"/>
       </w:pPr>
       <w:r>
-        <w:t xml:space="preserve">Attachment.BlobName är i dagsläget bara en textkolumn; ingen uppladdningsendpoint finns än. Azure Blob Storage och uppladdningsflödet är planerat till Fas 3.</w:t>
+        <w:t xml:space="preserve">Kör API:et: dotnet run --project src/Atlas.Api. Swagger UI öppnas på https://localhost:5081/swagger (eller http://localhost:5080/swagger).</w:t>
       </w:r>
     </w:p>
     <w:p>
@@ -4503,7 +4490,15 @@
         <w:spacing w:after="100"/>
       </w:pPr>
       <w:r>
-        <w:t xml:space="preserve">Anslutningssträngar och JWT-signeringsnyckeln ligger i appsettings.Development.json / user-secrets för lokal utveckling. I Azure ersätts detta av Key Vault och DefaultAzureCredential — inga hemligheter i App Service-konfigurationen.</w:t>
+        <w:t xml:space="preserve">Testa: registrera en användare (POST /api/auth/register — kräver ett giltigt organizationId, se bootstrap-anmärkningen i avsnitt 5.3), logga in, och använd token:en i Swagger UI:s Authorize-knapp eller som en Authorization: Bearer-header med curl.</w:t>
+      </w:r>
+    </w:p>
+    <w:p>
+      <w:pPr>
+        <w:spacing w:after="160"/>
+      </w:pPr>
+      <w:r>
+        <w:t xml:space="preserve">Fullständiga curl-exempel för samtliga endpoints (tickets, organizations, users) finns i README.md under “Try it”.</w:t>
       </w:r>
     </w:p>
     <w:p>
@@ -4517,6 +4512,93 @@
         <w:spacing w:after="200" w:before="400"/>
       </w:pPr>
       <w:r>
+        <w:t xml:space="preserve">7. Kända förenklingar och teknisk skuld</w:t>
+      </w:r>
+    </w:p>
+    <w:p>
+      <w:pPr>
+        <w:spacing w:after="160"/>
+      </w:pPr>
+      <w:r>
+        <w:t xml:space="preserve">Medvetna genvägar som finns kvar just nu, och när de är tänkta att åtgärdas:</w:t>
+      </w:r>
+    </w:p>
+    <w:p>
+      <w:pPr>
+        <w:pStyle w:val="ListParagraph"/>
+        <w:numPr>
+          <w:ilvl w:val="0"/>
+          <w:numId w:val="2"/>
+        </w:numPr>
+        <w:spacing w:after="100"/>
+      </w:pPr>
+      <w:r>
+        <w:t xml:space="preserve">Ingen token-återkallelse eller refresh-token-flöde: JWT:er är giltiga tills de går ut naturligt (Jwt:ExpiryMinutes). En inaktiverad användares befintliga token fortsätter alltså fungera fram till förfallotid — en roll- eller statusändring slår igenom först vid nästa inloggning.</w:t>
+      </w:r>
+    </w:p>
+    <w:p>
+      <w:pPr>
+        <w:pStyle w:val="ListParagraph"/>
+        <w:numPr>
+          <w:ilvl w:val="0"/>
+          <w:numId w:val="2"/>
+        </w:numPr>
+        <w:spacing w:after="100"/>
+      </w:pPr>
+      <w:r>
+        <w:t xml:space="preserve">Självregistrering (POST /api/auth/register) tillåter den som registrerar sig att välja vilken roll som helst, inklusive Admin, och vilket befintligt organizationId som helst. Ett medvetet dev/demo-bekvämlighet som en riktig driftsättning skulle ersätta med ett inbjudningsflöde eller en standardroll (Customer).</w:t>
+      </w:r>
+    </w:p>
+    <w:p>
+      <w:pPr>
+        <w:pStyle w:val="ListParagraph"/>
+        <w:numPr>
+          <w:ilvl w:val="0"/>
+          <w:numId w:val="2"/>
+        </w:numPr>
+        <w:spacing w:after="100"/>
+      </w:pPr>
+      <w:r>
+        <w:t xml:space="preserve">AuditLog- och Notification-tabellerna finns i schemat, men inget skriver till dem ännu — de kopplas in i senare faser (Service Bus-konsumenter respektive bakgrundsworkern för försenade ärenden).</w:t>
+      </w:r>
+    </w:p>
+    <w:p>
+      <w:pPr>
+        <w:pStyle w:val="ListParagraph"/>
+        <w:numPr>
+          <w:ilvl w:val="0"/>
+          <w:numId w:val="2"/>
+        </w:numPr>
+        <w:spacing w:after="100"/>
+      </w:pPr>
+      <w:r>
+        <w:t xml:space="preserve">Attachment.BlobName är i dagsläget bara en textkolumn; ingen uppladdningsendpoint finns än. Azure Blob Storage och uppladdningsflödet är planerat till Fas 3.</w:t>
+      </w:r>
+    </w:p>
+    <w:p>
+      <w:pPr>
+        <w:pStyle w:val="ListParagraph"/>
+        <w:numPr>
+          <w:ilvl w:val="0"/>
+          <w:numId w:val="2"/>
+        </w:numPr>
+        <w:spacing w:after="100"/>
+      </w:pPr>
+      <w:r>
+        <w:t xml:space="preserve">Anslutningssträngar och JWT-signeringsnyckeln ligger i appsettings.Development.json / user-secrets för lokal utveckling. I Azure ersätts detta av Key Vault och DefaultAzureCredential — inga hemligheter i App Service-konfigurationen.</w:t>
+      </w:r>
+    </w:p>
+    <w:p>
+      <w:r>
+        <w:br w:type="page"/>
+      </w:r>
+    </w:p>
+    <w:p>
+      <w:pPr>
+        <w:pStyle w:val="Heading1"/>
+        <w:spacing w:after="200" w:before="400"/>
+      </w:pPr>
+      <w:r>
         <w:t xml:space="preserve">8. Nästa steg</w:t>
       </w:r>
     </w:p>
@@ -4525,7 +4607,7 @@
         <w:spacing w:after="160"/>
       </w:pPr>
       <w:r>
-        <w:t xml:space="preserve">Del 7 — Projects- och Teams-hantering — är nu klar, vilket täcker CRUD för domänens huvudaggregat (Organization och User via Del 6; Project och Team via Del 7; Ticket sedan Del 1–4). Det som återstår av Fas 2 är rikare ticket-arbetsflöden — allt annat i fasen är på plats. Därefter tar Fas 3 vid: Del 8 (Azure-driftsättning), Del 9 (Azure SQL), Del 10 (Blob Storage) och Del 20 (Key Vault) — de faktiska Azure-tjänsterna som ersätter den lokala SQL Server-instansen och den lokala JWT-signeringsnyckeln.</w:t>
+        <w:t xml:space="preserve">Fas 2 är nu helt klar. Del 7 — Projects- och Teams-hantering — är klar, inklusive den sista symmetrin mellan Project och Team (RemoveMember och Unarchive), och de rikare ticket-arbetsflödena (se avsnitt 5.5) är också på plats: Reopen, tagg-hantering, ProjectId-filtrering och en riktig DELETE-endpoint bakom den tidigare dinglande Ticket.Delete-permissionen. Fas 2 täcker nu CRUD för samtliga huvudaggregat i domänen (Organization och User via Del 6; Project och Team via Del 7; Ticket sedan Fas 1, med de sista arbetsflödena på plats i samma steg som stängde Del 7). Nästa steg är Fas 3: Del 8 (Azure-driftsättning), Del 9 (Azure SQL), Del 10 (Blob Storage) och Del 20 (Key Vault) — de faktiska Azure-tjänsterna som ersätter den lokala SQL Server-instansen och den lokala JWT-signeringsnyckeln.</w:t>
       </w:r>
     </w:p>
     <w:p>

</xml_diff>

<commit_message>
Fas 3 - Del 8 Azuredriftsättning
</commit_message>
<xml_diff>
--- a/docs/ProjectAtlas_Systemdokumentation.docx
+++ b/docs/ProjectAtlas_Systemdokumentation.docx
@@ -86,7 +86,7 @@
           <w:sz w:val="20"/>
           <w:szCs w:val="20"/>
         </w:rPr>
-        <w:t xml:space="preserve">Senast uppdaterad: 9 september 2026 — status efter Del 7</w:t>
+        <w:t xml:space="preserve">Senast uppdaterad: 10 september 2026 — Fas 2 klar, Del 8 pågår</w:t>
       </w:r>
     </w:p>
     <w:p>
@@ -782,7 +782,7 @@
                 <w:sz w:val="20"/>
                 <w:szCs w:val="20"/>
               </w:rPr>
-              <w:t xml:space="preserve">Azure SQL, App Service, Blob Storage, Key Vault, Azure Entra ID</w:t>
+              <w:t xml:space="preserve">App Service + GitHub Actions CI/CD-pipeline (Del 8) byggt, ej ännu körd mot en skarp prenumeration; Azure SQL, Blob Storage, Key Vault, Azure Entra ID återstår</w:t>
             </w:r>
           </w:p>
         </w:tc>
@@ -806,11 +806,11 @@
               <w:rPr>
                 <w:b/>
                 <w:bCs/>
-                <w:color w:val="6C757D"/>
-                <w:sz w:val="20"/>
-                <w:szCs w:val="20"/>
-              </w:rPr>
-              <w:t xml:space="preserve">Planerat</w:t>
+                <w:color w:val="8A6D00"/>
+                <w:sz w:val="20"/>
+                <w:szCs w:val="20"/>
+              </w:rPr>
+              <w:t xml:space="preserve">Pågår</w:t>
             </w:r>
           </w:p>
         </w:tc>
@@ -2183,11 +2183,11 @@
               <w:rPr>
                 <w:b/>
                 <w:bCs/>
-                <w:color w:val="6C757D"/>
-                <w:sz w:val="20"/>
-                <w:szCs w:val="20"/>
-              </w:rPr>
-              <w:t xml:space="preserve">Planerat</w:t>
+                <w:color w:val="8A6D00"/>
+                <w:sz w:val="20"/>
+                <w:szCs w:val="20"/>
+              </w:rPr>
+              <w:t xml:space="preserve">Pågår</w:t>
             </w:r>
           </w:p>
         </w:tc>
@@ -4031,7 +4031,7 @@
         <w:spacing w:after="160"/>
       </w:pPr>
       <w:r>
-        <w:t xml:space="preserve">Det här avsnittet går igenom Del 1–7 konkret: vad som finns, och varför det ser ut som det gör.</w:t>
+        <w:t xml:space="preserve">Det här avsnittet går igenom Del 1–8 konkret: vad som finns, och varför det ser ut som det gör. Del 8 är markerat “pågår” snarare än “klart” — koden, pipelinen och dokumentationen finns, men är ännu inte körd mot en skarp Azure-prenumeration (se 5.6).</w:t>
       </w:r>
     </w:p>
     <w:p>
@@ -4407,12 +4407,19 @@
     </w:p>
     <w:p>
       <w:pPr>
-        <w:pStyle w:val="Heading1"/>
-        <w:pageBreakBefore/>
-        <w:spacing w:after="200" w:before="400"/>
-      </w:pPr>
-      <w:r>
-        <w:t xml:space="preserve">6. Kom igång</w:t>
+        <w:pStyle w:val="Heading2"/>
+        <w:spacing w:after="150" w:before="300"/>
+      </w:pPr>
+      <w:r>
+        <w:t xml:space="preserve">5.6 Del 8 — Azure-driftsättning (Fas 3, pågår)</w:t>
+      </w:r>
+    </w:p>
+    <w:p>
+      <w:pPr>
+        <w:spacing w:after="160"/>
+      </w:pPr>
+      <w:r>
+        <w:t xml:space="preserve">Kod, pipeline och dokumentation för Del 8 finns nu i repot — men Del 8 är markerat “pågår”, inte “klart”, eftersom det ännu inte är kört mot en skarp Azure-prenumeration. docs/AZURE_DEPLOYMENT.md är en körbar checklista med de faktiska az-kommandona; de körs medvetet av projektägaren själv, inte av något automatiserat verktyg, eftersom de är riktiga beslut om prenumeration, resursnamn och kostnad.</w:t>
       </w:r>
     </w:p>
     <w:p>
@@ -4425,7 +4432,7 @@
         <w:spacing w:after="100"/>
       </w:pPr>
       <w:r>
-        <w:t xml:space="preserve">Förutsättningar: .NET 10 SDK, en SQL Server-instans (LocalDB, Docker eller Azure SQL), samt dotnet-ef (dotnet tool install --global dotnet-ef).</w:t>
+        <w:t xml:space="preserve">Swagger-UI:ts synlighet styrs nu av en egen inställning (EnableSwaggerUi) i stället för app.Environment.IsDevelopment(). De två frågorna råkade ha samma svar så länge appen bara kördes lokalt, men i Azure vill man kunna slå på Swagger för portfolio-visning utan att av misstag också slå på auto-migrate-blocket vid uppstart — det blocket förblir hårt kopplat till IsDevelopment() av just den anledningen.</w:t>
       </w:r>
     </w:p>
     <w:p>
@@ -4438,7 +4445,7 @@
         <w:spacing w:after="100"/>
       </w:pPr>
       <w:r>
-        <w:t xml:space="preserve">Bygg: dotnet restore och dotnet build från lösningens rot.</w:t>
+        <w:t xml:space="preserve">ForwardedHeadersOptions + app.UseForwardedHeaders() löser ett klassiskt Azure App Service-fenomen: App Service avslutar TLS vid sin egen kant och skickar vidare requesten som vanlig HTTP internt. Utan att lita på X-Forwarded-Proto/-For-headrarna tror appen att varje request kom över HTTP, och app.UseHttpsRedirection() hamnar i en omdirigeringsloop mot en klient som redan pratar HTTPS.</w:t>
       </w:r>
     </w:p>
     <w:p>
@@ -4451,7 +4458,7 @@
         <w:spacing w:after="100"/>
       </w:pPr>
       <w:r>
-        <w:t xml:space="preserve">Databas: peka ConnectionStrings:AtlasDb i appsettings.Development.json (eller via dotnet user-secrets) mot en riktig SQL Server-instans.</w:t>
+        <w:t xml:space="preserve">MapHealthChecks("/health") är medvetet inte kopplad mot databasen — den backar App Services egen “Health check”-funktion, och måste fungera redan innan Del 9 finns. En databasberoende hälsokontroll (AddDbContextCheck) är ett naturligt tillägg när det finns en riktig molndatabas att fråga.</w:t>
       </w:r>
     </w:p>
     <w:p>
@@ -4464,7 +4471,7 @@
         <w:spacing w:after="100"/>
       </w:pPr>
       <w:r>
-        <w:t xml:space="preserve">Första migrationen: från src/Atlas.Api, kör dotnet ef migrations add InitialCreate --project ../Atlas.Infrastructure --startup-project . och sedan dotnet ef database update med samma flaggor.</w:t>
+        <w:t xml:space="preserve">GitHub Actions-pipelinen (.github/workflows/deploy.yml) autentiserar mot Azure via OIDC federated credentials, inte en lagrad klienthemlighet — workflowen växlar sin egen GitHub-utfärdade token mot en Azure AD-token vid körning, begränsat till ett repo och en branch. Inget hemlighetsliknande lagras i GitHub alls.</w:t>
       </w:r>
     </w:p>
     <w:p>
@@ -4477,7 +4484,7 @@
         <w:spacing w:after="100"/>
       </w:pPr>
       <w:r>
-        <w:t xml:space="preserve">Kör API:et: dotnet run --project src/Atlas.Api. Swagger UI öppnas på https://localhost:5081/swagger (eller http://localhost:5080/swagger).</w:t>
+        <w:t xml:space="preserve">Docker introduceras medvetet inte här, trots att App Service stödjer containerdriftsättning — det är Del 17:s scope (Fas 5). Del 8 driftsätter samma dotnet publish-utdata som dotnet run redan använder lokalt.</w:t>
       </w:r>
     </w:p>
     <w:p>
@@ -4490,37 +4497,17 @@
         <w:spacing w:after="100"/>
       </w:pPr>
       <w:r>
-        <w:t xml:space="preserve">Testa: registrera en användare (POST /api/auth/register — kräver ett giltigt organizationId, se bootstrap-anmärkningen i avsnitt 5.3), logga in, och använd token:en i Swagger UI:s Authorize-knapp eller som en Authorization: Bearer-header med curl.</w:t>
-      </w:r>
-    </w:p>
-    <w:p>
-      <w:pPr>
-        <w:spacing w:after="160"/>
-      </w:pPr>
-      <w:r>
-        <w:t xml:space="preserve">Fullständiga curl-exempel för samtliga endpoints (tickets, organizations, users) finns i README.md under “Try it”.</w:t>
-      </w:r>
-    </w:p>
-    <w:p>
-      <w:r>
-        <w:br w:type="page"/>
+        <w:t xml:space="preserve">Ärligt om vad som inte fungerar än: Azure kan inte nå den lokala SQL Server-instans som Del 1–7 har använt (den sitter bakom hemnätverkets NAT, inte en offentlig IP). Varje databasberoende endpoint kommer svara med fel i Azure tills Del 9 (Azure SQL) är på plats — bara /health, och Swagger om det slås på, är väntat att fungera under tiden.</w:t>
       </w:r>
     </w:p>
     <w:p>
       <w:pPr>
         <w:pStyle w:val="Heading1"/>
+        <w:pageBreakBefore/>
         <w:spacing w:after="200" w:before="400"/>
       </w:pPr>
       <w:r>
-        <w:t xml:space="preserve">7. Kända förenklingar och teknisk skuld</w:t>
-      </w:r>
-    </w:p>
-    <w:p>
-      <w:pPr>
-        <w:spacing w:after="160"/>
-      </w:pPr>
-      <w:r>
-        <w:t xml:space="preserve">Medvetna genvägar som finns kvar just nu, och när de är tänkta att åtgärdas:</w:t>
+        <w:t xml:space="preserve">6. Kom igång</w:t>
       </w:r>
     </w:p>
     <w:p>
@@ -4533,7 +4520,7 @@
         <w:spacing w:after="100"/>
       </w:pPr>
       <w:r>
-        <w:t xml:space="preserve">Ingen token-återkallelse eller refresh-token-flöde: JWT:er är giltiga tills de går ut naturligt (Jwt:ExpiryMinutes). En inaktiverad användares befintliga token fortsätter alltså fungera fram till förfallotid — en roll- eller statusändring slår igenom först vid nästa inloggning.</w:t>
+        <w:t xml:space="preserve">Förutsättningar: .NET 10 SDK, en SQL Server-instans (LocalDB, Docker eller Azure SQL), samt dotnet-ef (dotnet tool install --global dotnet-ef).</w:t>
       </w:r>
     </w:p>
     <w:p>
@@ -4546,7 +4533,7 @@
         <w:spacing w:after="100"/>
       </w:pPr>
       <w:r>
-        <w:t xml:space="preserve">Självregistrering (POST /api/auth/register) tillåter den som registrerar sig att välja vilken roll som helst, inklusive Admin, och vilket befintligt organizationId som helst. Ett medvetet dev/demo-bekvämlighet som en riktig driftsättning skulle ersätta med ett inbjudningsflöde eller en standardroll (Customer).</w:t>
+        <w:t xml:space="preserve">Bygg: dotnet restore och dotnet build från lösningens rot.</w:t>
       </w:r>
     </w:p>
     <w:p>
@@ -4559,7 +4546,7 @@
         <w:spacing w:after="100"/>
       </w:pPr>
       <w:r>
-        <w:t xml:space="preserve">AuditLog- och Notification-tabellerna finns i schemat, men inget skriver till dem ännu — de kopplas in i senare faser (Service Bus-konsumenter respektive bakgrundsworkern för försenade ärenden).</w:t>
+        <w:t xml:space="preserve">Databas: peka ConnectionStrings:AtlasDb i appsettings.Development.json (eller via dotnet user-secrets) mot en riktig SQL Server-instans.</w:t>
       </w:r>
     </w:p>
     <w:p>
@@ -4572,7 +4559,7 @@
         <w:spacing w:after="100"/>
       </w:pPr>
       <w:r>
-        <w:t xml:space="preserve">Attachment.BlobName är i dagsläget bara en textkolumn; ingen uppladdningsendpoint finns än. Azure Blob Storage och uppladdningsflödet är planerat till Fas 3.</w:t>
+        <w:t xml:space="preserve">Första migrationen: från src/Atlas.Api, kör dotnet ef migrations add InitialCreate --project ../Atlas.Infrastructure --startup-project . och sedan dotnet ef database update med samma flaggor.</w:t>
       </w:r>
     </w:p>
     <w:p>
@@ -4585,7 +4572,28 @@
         <w:spacing w:after="100"/>
       </w:pPr>
       <w:r>
-        <w:t xml:space="preserve">Anslutningssträngar och JWT-signeringsnyckeln ligger i appsettings.Development.json / user-secrets för lokal utveckling. I Azure ersätts detta av Key Vault och DefaultAzureCredential — inga hemligheter i App Service-konfigurationen.</w:t>
+        <w:t xml:space="preserve">Kör API:et: dotnet run --project src/Atlas.Api. Swagger UI öppnas på https://localhost:5081/swagger (eller http://localhost:5080/swagger).</w:t>
+      </w:r>
+    </w:p>
+    <w:p>
+      <w:pPr>
+        <w:pStyle w:val="ListParagraph"/>
+        <w:numPr>
+          <w:ilvl w:val="0"/>
+          <w:numId w:val="2"/>
+        </w:numPr>
+        <w:spacing w:after="100"/>
+      </w:pPr>
+      <w:r>
+        <w:t xml:space="preserve">Testa: registrera en användare (POST /api/auth/register — kräver ett giltigt organizationId, se bootstrap-anmärkningen i avsnitt 5.3), logga in, och använd token:en i Swagger UI:s Authorize-knapp eller som en Authorization: Bearer-header med curl.</w:t>
+      </w:r>
+    </w:p>
+    <w:p>
+      <w:pPr>
+        <w:spacing w:after="160"/>
+      </w:pPr>
+      <w:r>
+        <w:t xml:space="preserve">Fullständiga curl-exempel för samtliga endpoints (tickets, organizations, users) finns i README.md under “Try it”.</w:t>
       </w:r>
     </w:p>
     <w:p>
@@ -4599,6 +4607,106 @@
         <w:spacing w:after="200" w:before="400"/>
       </w:pPr>
       <w:r>
+        <w:t xml:space="preserve">7. Kända förenklingar och teknisk skuld</w:t>
+      </w:r>
+    </w:p>
+    <w:p>
+      <w:pPr>
+        <w:spacing w:after="160"/>
+      </w:pPr>
+      <w:r>
+        <w:t xml:space="preserve">Medvetna genvägar som finns kvar just nu, och när de är tänkta att åtgärdas:</w:t>
+      </w:r>
+    </w:p>
+    <w:p>
+      <w:pPr>
+        <w:pStyle w:val="ListParagraph"/>
+        <w:numPr>
+          <w:ilvl w:val="0"/>
+          <w:numId w:val="2"/>
+        </w:numPr>
+        <w:spacing w:after="100"/>
+      </w:pPr>
+      <w:r>
+        <w:t xml:space="preserve">App Service (Del 8) har ingenting bakom ConnectionStrings:AtlasDb ännu — Azure kan inte nå den lokala SQL Server-instans som Del 1–7 har använt (den sitter bakom hemnätverkets NAT, inte en offentlig IP). Varje databasberoende endpoint kommer att svara med fel i Azure tills Del 9 (Azure SQL) är på plats; bara /health, och Swagger om det slås på, är väntat att fungera under tiden. Se docs/AZURE_DEPLOYMENT.md.</w:t>
+      </w:r>
+    </w:p>
+    <w:p>
+      <w:pPr>
+        <w:pStyle w:val="ListParagraph"/>
+        <w:numPr>
+          <w:ilvl w:val="0"/>
+          <w:numId w:val="2"/>
+        </w:numPr>
+        <w:spacing w:after="100"/>
+      </w:pPr>
+      <w:r>
+        <w:t xml:space="preserve">Ingen token-återkallelse eller refresh-token-flöde: JWT:er är giltiga tills de går ut naturligt (Jwt:ExpiryMinutes). En inaktiverad användares befintliga token fortsätter alltså fungera fram till förfallotid — en roll- eller statusändring slår igenom först vid nästa inloggning.</w:t>
+      </w:r>
+    </w:p>
+    <w:p>
+      <w:pPr>
+        <w:pStyle w:val="ListParagraph"/>
+        <w:numPr>
+          <w:ilvl w:val="0"/>
+          <w:numId w:val="2"/>
+        </w:numPr>
+        <w:spacing w:after="100"/>
+      </w:pPr>
+      <w:r>
+        <w:t xml:space="preserve">Självregistrering (POST /api/auth/register) tillåter den som registrerar sig att välja vilken roll som helst, inklusive Admin, och vilket befintligt organizationId som helst. Ett medvetet dev/demo-bekvämlighet som en riktig driftsättning skulle ersätta med ett inbjudningsflöde eller en standardroll (Customer).</w:t>
+      </w:r>
+    </w:p>
+    <w:p>
+      <w:pPr>
+        <w:pStyle w:val="ListParagraph"/>
+        <w:numPr>
+          <w:ilvl w:val="0"/>
+          <w:numId w:val="2"/>
+        </w:numPr>
+        <w:spacing w:after="100"/>
+      </w:pPr>
+      <w:r>
+        <w:t xml:space="preserve">AuditLog- och Notification-tabellerna finns i schemat, men inget skriver till dem ännu — de kopplas in i senare faser (Service Bus-konsumenter respektive bakgrundsworkern för försenade ärenden).</w:t>
+      </w:r>
+    </w:p>
+    <w:p>
+      <w:pPr>
+        <w:pStyle w:val="ListParagraph"/>
+        <w:numPr>
+          <w:ilvl w:val="0"/>
+          <w:numId w:val="2"/>
+        </w:numPr>
+        <w:spacing w:after="100"/>
+      </w:pPr>
+      <w:r>
+        <w:t xml:space="preserve">Attachment.BlobName är i dagsläget bara en textkolumn; ingen uppladdningsendpoint finns än. Azure Blob Storage och uppladdningsflödet är planerat till Del 10.</w:t>
+      </w:r>
+    </w:p>
+    <w:p>
+      <w:pPr>
+        <w:pStyle w:val="ListParagraph"/>
+        <w:numPr>
+          <w:ilvl w:val="0"/>
+          <w:numId w:val="2"/>
+        </w:numPr>
+        <w:spacing w:after="100"/>
+      </w:pPr>
+      <w:r>
+        <w:t xml:space="preserve">Anslutningssträngar och JWT-signeringsnyckeln ligger i appsettings.Development.json / user-secrets lokalt, och som vanliga (ej valv-skyddade) Azure App Service-inställningar i molnet sedan Del 8 — ett steg upp från en committad fil, men fortfarande en hemlighet i App Service-konfigurationen snarare än ett valv. Del 20 ersätter det med Key Vault och DefaultAzureCredential.</w:t>
+      </w:r>
+    </w:p>
+    <w:p>
+      <w:r>
+        <w:br w:type="page"/>
+      </w:r>
+    </w:p>
+    <w:p>
+      <w:pPr>
+        <w:pStyle w:val="Heading1"/>
+        <w:spacing w:after="200" w:before="400"/>
+      </w:pPr>
+      <w:r>
         <w:t xml:space="preserve">8. Nästa steg</w:t>
       </w:r>
     </w:p>
@@ -4607,7 +4715,7 @@
         <w:spacing w:after="160"/>
       </w:pPr>
       <w:r>
-        <w:t xml:space="preserve">Fas 2 är nu helt klar. Del 7 — Projects- och Teams-hantering — är klar, inklusive den sista symmetrin mellan Project och Team (RemoveMember och Unarchive), och de rikare ticket-arbetsflödena (se avsnitt 5.5) är också på plats: Reopen, tagg-hantering, ProjectId-filtrering och en riktig DELETE-endpoint bakom den tidigare dinglande Ticket.Delete-permissionen. Fas 2 täcker nu CRUD för samtliga huvudaggregat i domänen (Organization och User via Del 6; Project och Team via Del 7; Ticket sedan Fas 1, med de sista arbetsflödena på plats i samma steg som stängde Del 7). Nästa steg är Fas 3: Del 8 (Azure-driftsättning), Del 9 (Azure SQL), Del 10 (Blob Storage) och Del 20 (Key Vault) — de faktiska Azure-tjänsterna som ersätter den lokala SQL Server-instansen och den lokala JWT-signeringsnyckeln.</w:t>
+        <w:t xml:space="preserve">Fas 2 är helt klar (se avsnitt 5.1–5.5). Fas 3 — Azure — är igång: Del 8 (se 5.6) har App Service-infrastrukturen, en lösenordsfri GitHub Actions-pipeline och en körbar checklista (docs/AZURE_DEPLOYMENT.md) på plats, men är märkt “pågår” tills den faktiskt körs mot en skarp prenumeration i Sweden Central. Nästa konkreta steg är att köra den checklistan, och därefter Del 9 (Azure SQL) — det är det steget som gör API:et funktionellt i molnet, eftersom Azure inte kan nå den lokala SQL Server-instansen App Service pekar mot idag. Del 10 (Blob Storage) och Del 20 (Key Vault) följer efter det.</w:t>
       </w:r>
     </w:p>
     <w:p>

</xml_diff>

<commit_message>
First successfully pipeline done - Healthy works
</commit_message>
<xml_diff>
--- a/docs/ProjectAtlas_Systemdokumentation.docx
+++ b/docs/ProjectAtlas_Systemdokumentation.docx
@@ -86,7 +86,7 @@
           <w:sz w:val="20"/>
           <w:szCs w:val="20"/>
         </w:rPr>
-        <w:t xml:space="preserve">Senast uppdaterad: 10 september 2026 — Fas 2 klar, Del 8 pågår</w:t>
+        <w:t xml:space="preserve">Senast uppdaterad: 10 september 2026 — Fas 2 klar, Del 8 klart och verifierat mot en skarp Azure-prenumeration</w:t>
       </w:r>
     </w:p>
     <w:p>
@@ -782,7 +782,7 @@
                 <w:sz w:val="20"/>
                 <w:szCs w:val="20"/>
               </w:rPr>
-              <w:t xml:space="preserve">App Service + GitHub Actions CI/CD-pipeline (Del 8) byggt, ej ännu körd mot en skarp prenumeration; Azure SQL, Blob Storage, Key Vault, Azure Entra ID återstår</w:t>
+              <w:t xml:space="preserve">App Service + Azure Pipelines CI/CD-pipeline och JWT-nyckeln i Key Vault (Del 8) klart och verifierat mot en skarp prenumeration; Azure SQL, Blob Storage, generalisering av Key Vault, Azure Entra ID återstår</w:t>
             </w:r>
           </w:p>
         </w:tc>
@@ -1034,7 +1034,7 @@
                 <w:sz w:val="20"/>
                 <w:szCs w:val="20"/>
               </w:rPr>
-              <w:t xml:space="preserve">GitHub Actions CI/CD, Bicep (Infrastructure as Code)</w:t>
+              <w:t xml:space="preserve">Bicep (Infrastructure as Code) — CI/CD finns redan sedan Del 8, på Azure Pipelines</w:t>
             </w:r>
           </w:p>
         </w:tc>
@@ -2132,7 +2132,7 @@
                 <w:sz w:val="20"/>
                 <w:szCs w:val="20"/>
               </w:rPr>
-              <w:t xml:space="preserve">Azure-driftsättning — App Service, GitHub Actions-pipeline mot Azure</w:t>
+              <w:t xml:space="preserve">Azure-driftsättning — App Service, Azure Pipelines mot Azure, JWT-nyckel i Key Vault</w:t>
             </w:r>
           </w:p>
         </w:tc>
@@ -2183,11 +2183,11 @@
               <w:rPr>
                 <w:b/>
                 <w:bCs/>
-                <w:color w:val="8A6D00"/>
-                <w:sz w:val="20"/>
-                <w:szCs w:val="20"/>
-              </w:rPr>
-              <w:t xml:space="preserve">Pågår</w:t>
+                <w:color w:val="2E7D32"/>
+                <w:sz w:val="20"/>
+                <w:szCs w:val="20"/>
+              </w:rPr>
+              <w:t xml:space="preserve">Klart</w:t>
             </w:r>
           </w:p>
         </w:tc>
@@ -3242,7 +3242,7 @@
                 <w:sz w:val="20"/>
                 <w:szCs w:val="20"/>
               </w:rPr>
-              <w:t xml:space="preserve">CI/CD — GitHub Actions: build, test, docker build, deploy</w:t>
+              <w:t xml:space="preserve">CI/CD — utöka Azure Pipelines-pipelinen från Del 8 med docker build</w:t>
             </w:r>
           </w:p>
         </w:tc>
@@ -3464,7 +3464,7 @@
                 <w:sz w:val="20"/>
                 <w:szCs w:val="20"/>
               </w:rPr>
-              <w:t xml:space="preserve">Key Vault — hemligheter (connection strings, JWT-nyckel) bort ur config</w:t>
+              <w:t xml:space="preserve">Key Vault — generalisera Del 8:s uppsättning (t.ex. eget provisionerat valv) och flytta in Azure SQL-anslutningssträngen</w:t>
             </w:r>
           </w:p>
         </w:tc>
@@ -4031,7 +4031,7 @@
         <w:spacing w:after="160"/>
       </w:pPr>
       <w:r>
-        <w:t xml:space="preserve">Det här avsnittet går igenom Del 1–8 konkret: vad som finns, och varför det ser ut som det gör. Del 8 är markerat “pågår” snarare än “klart” — koden, pipelinen och dokumentationen finns, men är ännu inte körd mot en skarp Azure-prenumeration (se 5.6).</w:t>
+        <w:t xml:space="preserve">Det här avsnittet går igenom Del 1–8 konkret: vad som finns, och varför det ser ut som det gör. Del 8 är markerat “klart” — koden, pipelinen och dokumentationen finns, och är sedan 2026-09-10 verifierad mot en skarp Azure-prenumeration (se 5.6).</w:t>
       </w:r>
     </w:p>
     <w:p>
@@ -4411,7 +4411,7 @@
         <w:spacing w:after="150" w:before="300"/>
       </w:pPr>
       <w:r>
-        <w:t xml:space="preserve">5.6 Del 8 — Azure-driftsättning (Fas 3, pågår)</w:t>
+        <w:t xml:space="preserve">5.6 Del 8 — Azure-driftsättning (Fas 3, klart)</w:t>
       </w:r>
     </w:p>
     <w:p>
@@ -4419,7 +4419,7 @@
         <w:spacing w:after="160"/>
       </w:pPr>
       <w:r>
-        <w:t xml:space="preserve">Kod, pipeline och dokumentation för Del 8 finns nu i repot — men Del 8 är markerat “pågår”, inte “klart”, eftersom det ännu inte är kört mot en skarp Azure-prenumeration. docs/AZURE_DEPLOYMENT.md är en körbar checklista med de faktiska az-kommandona; de körs medvetet av projektägaren själv, inte av något automatiserat verktyg, eftersom de är riktiga beslut om prenumeration, resursnamn och kostnad.</w:t>
+        <w:t xml:space="preserve">Kod, pipeline och dokumentation för Del 8 finns i repot och är sedan 2026-09-10 verifierad mot en skarp Azure-prenumeration: Key Vault-rolltilldelningen gick igenom, pipelinen körde build/test/deploy grönt, och GET /health svarar Healthy från https://app-projectatlas-dev-sc.azurewebsites.net/health. docs/AZURE_DEPLOYMENT.md är den körbara checklistan med de faktiska az-kommandona och portalstegen; de körs medvetet av projektägaren själv, inte av något automatiserat verktyg, eftersom de är riktiga beslut om prenumeration, resursnamn och kostnad.</w:t>
       </w:r>
     </w:p>
     <w:p>
@@ -4471,7 +4471,20 @@
         <w:spacing w:after="100"/>
       </w:pPr>
       <w:r>
-        <w:t xml:space="preserve">GitHub Actions-pipelinen (.github/workflows/deploy.yml) autentiserar mot Azure via OIDC federated credentials, inte en lagrad klienthemlighet — workflowen växlar sin egen GitHub-utfärdade token mot en Azure AD-token vid körning, begränsat till ett repo och en branch. Inget hemlighetsliknande lagras i GitHub alls.</w:t>
+        <w:t xml:space="preserve">Key Vault drogs in från Del 20 redan här, av ett praktiskt skäl: Peters prenumeration hade redan ett Key Vault. Att först bygga en osäker mellanversion — JWT-signeringsnyckeln som en vanlig, klartext Application Setting — bara för att riva upp den igen när Del 20 formellt kom, hade varit rent kastat arbete. App Service autentiserar mot valvet via en system-assigned managed identity (RBAC-rollen “Key Vault Secrets User”, scopad till just det valvet) — ingen lagrad nyckel eller anslutningssträng behövs för att komma åt hemligheterna. Del 9:s Azure SQL-anslutningssträng ansluter till samma mönster när den landar; Del 20 handlar nu mest om att generalisera den här redan fungerande lösningen.</w:t>
+      </w:r>
+    </w:p>
+    <w:p>
+      <w:pPr>
+        <w:pStyle w:val="ListParagraph"/>
+        <w:numPr>
+          <w:ilvl w:val="0"/>
+          <w:numId w:val="2"/>
+        </w:numPr>
+        <w:spacing w:after="100"/>
+      </w:pPr>
+      <w:r>
+        <w:t xml:space="preserve">Pipelinen kör på Azure Pipelines (Azure DevOps), inte GitHub Actions — Peters källkod ligger i Azure Repos. Autentiseringen mot Azure är lösenordsfri (workload identity federation), samma grundidé som GitHub Actions OIDC, men konfigurerad helt i Azure DevOps-portalen: en Azure Resource Manager-service connection med “Workload Identity federation (automatic)”, scopad till resursgruppen. Den skapar app-registreringen, service principal och det federerade förtroendet i ett enda guidat steg — pipelinen (azure-pipelines.yml) refererar bara till service connection-namnet, inga client-id/tenant-id/subscription-id-värden lagrade någonstans.</w:t>
       </w:r>
     </w:p>
     <w:p>
@@ -4497,7 +4510,7 @@
         <w:spacing w:after="100"/>
       </w:pPr>
       <w:r>
-        <w:t xml:space="preserve">Ärligt om vad som inte fungerar än: Azure kan inte nå den lokala SQL Server-instans som Del 1–7 har använt (den sitter bakom hemnätverkets NAT, inte en offentlig IP). Varje databasberoende endpoint kommer svara med fel i Azure tills Del 9 (Azure SQL) är på plats — bara /health, och Swagger om det slås på, är väntat att fungera under tiden.</w:t>
+        <w:t xml:space="preserve">Ärligt om vad som inte fungerar än: Azure kan inte nå den lokala SQL Server-instans som Del 1–7 har använt (den sitter bakom hemnätverkets NAT, inte en offentlig IP). Varje databasberoende endpoint svarar med fel i Azure tills Del 9 (Azure SQL) är på plats — bara /health, och Swagger om det slås på, fungerar under tiden. Det är inte en bugg i det som är byggt, utan precis vad man förväntar sig av en driftsättning som ännu inte har en molndatabas bakom sig.</w:t>
       </w:r>
     </w:p>
     <w:p>
@@ -4693,7 +4706,7 @@
         <w:spacing w:after="100"/>
       </w:pPr>
       <w:r>
-        <w:t xml:space="preserve">Anslutningssträngar och JWT-signeringsnyckeln ligger i appsettings.Development.json / user-secrets lokalt, och som vanliga (ej valv-skyddade) Azure App Service-inställningar i molnet sedan Del 8 — ett steg upp från en committad fil, men fortfarande en hemlighet i App Service-konfigurationen snarare än ett valv. Del 20 ersätter det med Key Vault och DefaultAzureCredential.</w:t>
+        <w:t xml:space="preserve">JWT-signeringsnyckeln ligger i appsettings.Development.json / user-secrets lokalt, och som en Azure Key Vault-hemlighet i molnet sedan Del 8 (draget in från Del 20 eftersom ett valv redan fanns tillgängligt — se 5.6). Azure SQL-anslutningssträngen (Del 9) finns inte alls ännu; när den landar följer den samma Key Vault-mönster i stället för att upprepa Del 8:s ursprungliga plan med en vanlig App Service-inställning. Del 20 handlar därmed mest om att generalisera en redan fungerande lösning, inte om att introducera Key Vault från grunden.</w:t>
       </w:r>
     </w:p>
     <w:p>
@@ -4715,7 +4728,7 @@
         <w:spacing w:after="160"/>
       </w:pPr>
       <w:r>
-        <w:t xml:space="preserve">Fas 2 är helt klar (se avsnitt 5.1–5.5). Fas 3 — Azure — är igång: Del 8 (se 5.6) har App Service-infrastrukturen, en lösenordsfri GitHub Actions-pipeline och en körbar checklista (docs/AZURE_DEPLOYMENT.md) på plats, men är märkt “pågår” tills den faktiskt körs mot en skarp prenumeration i Sweden Central. Nästa konkreta steg är att köra den checklistan, och därefter Del 9 (Azure SQL) — det är det steget som gör API:et funktionellt i molnet, eftersom Azure inte kan nå den lokala SQL Server-instansen App Service pekar mot idag. Del 10 (Blob Storage) och Del 20 (Key Vault) följer efter det.</w:t>
+        <w:t xml:space="preserve">Fas 2 är helt klar (se avsnitt 5.1–5.5). Fas 3 — Azure — är igång: Del 8 (se 5.6) är klart och verifierat mot en skarp prenumeration i Sweden Central — App Service-infrastrukturen, en lösenordsfri Azure Pipelines-pipeline (Azure DevOps) och JWT-signeringsnyckeln i Key Vault svarar alla som de ska. Nästa konkreta steg är Del 9 (Azure SQL) — det är det steget som gör API:et funktionellt i molnet, eftersom Azure inte kan nå den lokala SQL Server-instansen App Service pekar mot idag. Del 10 (Blob Storage) och Del 20 (generalisera Key Vault-uppsättningen) följer efter det.</w:t>
       </w:r>
     </w:p>
     <w:p>

</xml_diff>

<commit_message>
Fas 3 - Del 9 Azure SQL klart
</commit_message>
<xml_diff>
--- a/docs/ProjectAtlas_Systemdokumentation.docx
+++ b/docs/ProjectAtlas_Systemdokumentation.docx
@@ -86,7 +86,7 @@
           <w:sz w:val="20"/>
           <w:szCs w:val="20"/>
         </w:rPr>
-        <w:t xml:space="preserve">Senast uppdaterad: 10 september 2026 — Fas 2 klar, Del 8 klart och verifierat mot en skarp Azure-prenumeration</w:t>
+        <w:t xml:space="preserve">Senast uppdaterad: 10 september 2026 — Fas 2 klar, Del 8 och Del 9 klara och verifierade mot en skarp Azure-prenumeration</w:t>
       </w:r>
     </w:p>
     <w:p>
@@ -782,7 +782,7 @@
                 <w:sz w:val="20"/>
                 <w:szCs w:val="20"/>
               </w:rPr>
-              <w:t xml:space="preserve">App Service + Azure Pipelines CI/CD-pipeline och JWT-nyckeln i Key Vault (Del 8) klart och verifierat mot en skarp prenumeration; Azure SQL, Blob Storage, generalisering av Key Vault, Azure Entra ID återstår</w:t>
+              <w:t xml:space="preserve">App Service + Azure Pipelines CI/CD-pipeline, JWT-nyckeln i Key Vault (Del 8) och Azure SQL med anslutningssträngen i Key Vault (Del 9) — båda klara och verifierade mot en skarp prenumeration; Blob Storage, generalisering av Key Vault, Azure Entra ID återstår</w:t>
             </w:r>
           </w:p>
         </w:tc>
@@ -2294,11 +2294,11 @@
               <w:rPr>
                 <w:b/>
                 <w:bCs/>
-                <w:color w:val="6C757D"/>
-                <w:sz w:val="20"/>
-                <w:szCs w:val="20"/>
-              </w:rPr>
-              <w:t xml:space="preserve">Planerat</w:t>
+                <w:color w:val="2E7D32"/>
+                <w:sz w:val="20"/>
+                <w:szCs w:val="20"/>
+              </w:rPr>
+              <w:t xml:space="preserve">Klart</w:t>
             </w:r>
           </w:p>
         </w:tc>
@@ -3464,7 +3464,7 @@
                 <w:sz w:val="20"/>
                 <w:szCs w:val="20"/>
               </w:rPr>
-              <w:t xml:space="preserve">Key Vault — generalisera Del 8:s uppsättning (t.ex. eget provisionerat valv) och flytta in Azure SQL-anslutningssträngen</w:t>
+              <w:t xml:space="preserve">Key Vault — generalisera Del 8/9:s uppsättning (t.ex. eget provisionerat valv) och byta ut den återanvända SQL-admin-inloggningen mot en snävare</w:t>
             </w:r>
           </w:p>
         </w:tc>
@@ -4031,7 +4031,7 @@
         <w:spacing w:after="160"/>
       </w:pPr>
       <w:r>
-        <w:t xml:space="preserve">Det här avsnittet går igenom Del 1–8 konkret: vad som finns, och varför det ser ut som det gör. Del 8 är markerat “klart” — koden, pipelinen och dokumentationen finns, och är sedan 2026-09-10 verifierad mot en skarp Azure-prenumeration (se 5.6).</w:t>
+        <w:t xml:space="preserve">Det här avsnittet går igenom Del 1–9 konkret: vad som finns, och varför det ser ut som det gör. Både Del 8 och Del 9 är markerade “klart” — koden, pipelinen och dokumentationen finns, och är sedan 2026-09-10 verifierade mot en skarp Azure-prenumeration (se 5.6 respektive 5.7).</w:t>
       </w:r>
     </w:p>
     <w:p>
@@ -4458,20 +4458,20 @@
         <w:spacing w:after="100"/>
       </w:pPr>
       <w:r>
-        <w:t xml:space="preserve">MapHealthChecks("/health") är medvetet inte kopplad mot databasen — den backar App Services egen “Health check”-funktion, och måste fungera redan innan Del 9 finns. En databasberoende hälsokontroll (AddDbContextCheck) är ett naturligt tillägg när det finns en riktig molndatabas att fråga.</w:t>
-      </w:r>
-    </w:p>
-    <w:p>
-      <w:pPr>
-        <w:pStyle w:val="ListParagraph"/>
-        <w:numPr>
-          <w:ilvl w:val="0"/>
-          <w:numId w:val="2"/>
-        </w:numPr>
-        <w:spacing w:after="100"/>
-      </w:pPr>
-      <w:r>
-        <w:t xml:space="preserve">Key Vault drogs in från Del 20 redan här, av ett praktiskt skäl: Peters prenumeration hade redan ett Key Vault. Att först bygga en osäker mellanversion — JWT-signeringsnyckeln som en vanlig, klartext Application Setting — bara för att riva upp den igen när Del 20 formellt kom, hade varit rent kastat arbete. App Service autentiserar mot valvet via en system-assigned managed identity (RBAC-rollen “Key Vault Secrets User”, scopad till just det valvet) — ingen lagrad nyckel eller anslutningssträng behövs för att komma åt hemligheterna. Del 9:s Azure SQL-anslutningssträng ansluter till samma mönster när den landar; Del 20 handlar nu mest om att generalisera den här redan fungerande lösningen.</w:t>
+        <w:t xml:space="preserve">MapHealthChecks("/health") är medvetet inte kopplad mot databasen — den backar App Services egen “Health check”-funktion, och behövde fungera redan innan Del 9 fanns en databas att fråga. En databasberoende hälsokontroll (AddDbContextCheck) är fortfarande ett naturligt tillägg, men inget som gjorts än.</w:t>
+      </w:r>
+    </w:p>
+    <w:p>
+      <w:pPr>
+        <w:pStyle w:val="ListParagraph"/>
+        <w:numPr>
+          <w:ilvl w:val="0"/>
+          <w:numId w:val="2"/>
+        </w:numPr>
+        <w:spacing w:after="100"/>
+      </w:pPr>
+      <w:r>
+        <w:t xml:space="preserve">Key Vault drogs in från Del 20 redan här, av ett praktiskt skäl: Peters prenumeration hade redan ett Key Vault. Att först bygga en osäker mellanversion — JWT-signeringsnyckeln som en vanlig, klartext Application Setting — bara för att riva upp den igen när Del 20 formellt kom, hade varit rent kastat arbete. App Service autentiserar mot valvet via en system-assigned managed identity (RBAC-rollen “Key Vault Secrets User”, scopad till just det valvet) — ingen lagrad nyckel eller anslutningssträng behövs för att komma åt hemligheterna. Del 9:s Azure SQL-anslutningssträng (se 5.7) ansluter sedan till exakt samma mönster; Del 20 handlar nu mest om att generalisera den här redan fungerande lösningen.</w:t>
       </w:r>
     </w:p>
     <w:p>
@@ -4510,7 +4510,76 @@
         <w:spacing w:after="100"/>
       </w:pPr>
       <w:r>
-        <w:t xml:space="preserve">Ärligt om vad som inte fungerar än: Azure kan inte nå den lokala SQL Server-instans som Del 1–7 har använt (den sitter bakom hemnätverkets NAT, inte en offentlig IP). Varje databasberoende endpoint svarar med fel i Azure tills Del 9 (Azure SQL) är på plats — bara /health, och Swagger om det slås på, fungerar under tiden. Det är inte en bugg i det som är byggt, utan precis vad man förväntar sig av en driftsättning som ännu inte har en molndatabas bakom sig.</w:t>
+        <w:t xml:space="preserve">Ärligt om vad som inte fungerade än när det här skrevs: Azure kunde inte nå den lokala SQL Server-instans som Del 1–7 hade använt (den sitter bakom hemnätverkets NAT, inte en offentlig IP). Del 9 (se 5.7 nedan) stänger det gapet.</w:t>
+      </w:r>
+    </w:p>
+    <w:p>
+      <w:pPr>
+        <w:pStyle w:val="Heading2"/>
+        <w:spacing w:after="150" w:before="300"/>
+      </w:pPr>
+      <w:r>
+        <w:t xml:space="preserve">5.7 Del 9 — Azure SQL (Fas 3, klart)</w:t>
+      </w:r>
+    </w:p>
+    <w:p>
+      <w:pPr>
+        <w:spacing w:after="160"/>
+      </w:pPr>
+      <w:r>
+        <w:t xml:space="preserve">Samma återanvänd-det-som-redan-finns-princip som Key Vault: Peter hade redan en Azure SQL-server i sin prenumeration, så Del 9 skapar bara en ny, tom databas på den (serverless General Purpose med Azures gratiskvot — 100 000 vCore-sekunder/månad, auto-pause vid inaktivitet) i stället för att sätta upp en helt ny server. Anslutningssträngen följer exakt samma mönster som JWT-nyckeln in i Key Vault, som ConnectionStrings--AtlasDb — ingen ny App Setting behövdes, eftersom KeyVault:Name redan var på plats sedan Del 8.</w:t>
+      </w:r>
+    </w:p>
+    <w:p>
+      <w:pPr>
+        <w:pStyle w:val="ListParagraph"/>
+        <w:numPr>
+          <w:ilvl w:val="0"/>
+          <w:numId w:val="2"/>
+        </w:numPr>
+        <w:spacing w:after="100"/>
+      </w:pPr>
+      <w:r>
+        <w:t xml:space="preserve">sqlOptions.EnableRetryOnFailure(...) i DependencyInjection.cs har funnits sedan Fas 1, långt innan det fanns någon molndatabas som behövde det — det visade sig göra nytta på riktigt här: Azure SQL ser övergående fel (en serverless-databas som vaknar från paus, ett kort nätverksglapp) på ett sätt en lokal SQL Server-instans i praktiken aldrig gör.</w:t>
+      </w:r>
+    </w:p>
+    <w:p>
+      <w:pPr>
+        <w:pStyle w:val="ListParagraph"/>
+        <w:numPr>
+          <w:ilvl w:val="0"/>
+          <w:numId w:val="2"/>
+        </w:numPr>
+        <w:spacing w:after="100"/>
+      </w:pPr>
+      <w:r>
+        <w:t xml:space="preserve">Verifierat end-to-end mot den skarpa prenumerationen 2026-09-10: POST /api/auth/register genom App Service returnerar en riktig, signerad JWT med rätt claims och behörighetslista — det slutgiltiga beviset på att hela kedjan (App Service → Key Vault → managed identity → Azure SQL) fungerar.</w:t>
+      </w:r>
+    </w:p>
+    <w:p>
+      <w:pPr>
+        <w:pStyle w:val="ListParagraph"/>
+        <w:numPr>
+          <w:ilvl w:val="0"/>
+          <w:numId w:val="2"/>
+        </w:numPr>
+        <w:spacing w:after="100"/>
+      </w:pPr>
+      <w:r>
+        <w:t xml:space="preserve">En riktig bugg hittades och fixades på vägen, inte ett Azure-krångel: sql/001_InitialSchema.sql — den handskrivna schemareferensen vars egen filhuvud varnar för att den INTE ska köras direkt — hade tyst glidit isär från EF-modellen sedan Del 5 lade till User.PasswordHash; ingen hade rört filen sedan dess. Den kördes ändå av misstag mot den nya Azure SQL-databasen (lätt hänt i portalens Query editor), vilket gav en Users-tabell utan den kolumnen och en 500:a utan användbar information (exception-döljande middleware gjorde precis sitt jobb — az webapp log tail var det som till slut visade "Invalid column name 'PasswordHash'"). Fixen: rätta referensfilen, och bygga om Azure SQL-schemat rent från dotnet ef database update — allt annat hade riskerat samma typ av tyst drift igen.</w:t>
+      </w:r>
+    </w:p>
+    <w:p>
+      <w:pPr>
+        <w:pStyle w:val="ListParagraph"/>
+        <w:numPr>
+          <w:ilvl w:val="0"/>
+          <w:numId w:val="2"/>
+        </w:numPr>
+        <w:spacing w:after="100"/>
+      </w:pPr>
+      <w:r>
+        <w:t xml:space="preserve">En medveten genväg, ärligt dokumenterad: Key Vault-hemligheten återanvänder SQL-serverns admin-inloggning i stället för en ny, snävare inloggning skapad enbart för AtlasDb. Att skapa en sådan kräver ett T-SQL-klientverktyg (CREATE LOGIN/CREATE USER), inte ett az-kommando — ett naturligt städjobb för Del 20.</w:t>
       </w:r>
     </w:p>
     <w:p>
@@ -4641,7 +4710,7 @@
         <w:spacing w:after="100"/>
       </w:pPr>
       <w:r>
-        <w:t xml:space="preserve">App Service (Del 8) har ingenting bakom ConnectionStrings:AtlasDb ännu — Azure kan inte nå den lokala SQL Server-instans som Del 1–7 har använt (den sitter bakom hemnätverkets NAT, inte en offentlig IP). Varje databasberoende endpoint kommer att svara med fel i Azure tills Del 9 (Azure SQL) är på plats; bara /health, och Swagger om det slås på, är väntat att fungera under tiden. Se docs/AZURE_DEPLOYMENT.md.</w:t>
+        <w:t xml:space="preserve">Azure SQL (Del 9) återanvänder Peters befintliga SQL-serverinloggning för tillfället — Key Vault-hemligheten innehåller server-adminens egna uppgifter i stället för en ny inloggning scopad enbart till AtlasDb. Att skapa en sådan kräver ett T-SQL-klientverktyg (CREATE LOGIN/CREATE USER), inte ett az-kommando, vilket är varför det är uppskjutet snarare än gjort direkt — ett bra kandidat-städjobb för Del 20. Se docs/AZURE_DEPLOYMENT.md avsnitt 7.4.</w:t>
       </w:r>
     </w:p>
     <w:p>
@@ -4706,7 +4775,7 @@
         <w:spacing w:after="100"/>
       </w:pPr>
       <w:r>
-        <w:t xml:space="preserve">JWT-signeringsnyckeln ligger i appsettings.Development.json / user-secrets lokalt, och som en Azure Key Vault-hemlighet i molnet sedan Del 8 (draget in från Del 20 eftersom ett valv redan fanns tillgängligt — se 5.6). Azure SQL-anslutningssträngen (Del 9) finns inte alls ännu; när den landar följer den samma Key Vault-mönster i stället för att upprepa Del 8:s ursprungliga plan med en vanlig App Service-inställning. Del 20 handlar därmed mest om att generalisera en redan fungerande lösning, inte om att introducera Key Vault från grunden.</w:t>
+        <w:t xml:space="preserve">Både JWT-signeringsnyckeln och Azure SQL-anslutningssträngen ligger i appsettings.Development.json / user-secrets lokalt, och som Azure Key Vault-hemligheter i molnet (Jwt--SigningKey sedan Del 8, ConnectionStrings--AtlasDb sedan Del 9 — båda draget in från Del 20 eftersom ett valv redan fanns tillgängligt — se 5.6 och 5.7). Del 20 handlar därmed mest om att generalisera en redan fungerande lösning och byta ut den återanvända server-admin-inloggningen mot en snävare, inte om att introducera Key Vault från grunden.</w:t>
       </w:r>
     </w:p>
     <w:p>
@@ -4728,7 +4797,7 @@
         <w:spacing w:after="160"/>
       </w:pPr>
       <w:r>
-        <w:t xml:space="preserve">Fas 2 är helt klar (se avsnitt 5.1–5.5). Fas 3 — Azure — är igång: Del 8 (se 5.6) är klart och verifierat mot en skarp prenumeration i Sweden Central — App Service-infrastrukturen, en lösenordsfri Azure Pipelines-pipeline (Azure DevOps) och JWT-signeringsnyckeln i Key Vault svarar alla som de ska. Nästa konkreta steg är Del 9 (Azure SQL) — det är det steget som gör API:et funktionellt i molnet, eftersom Azure inte kan nå den lokala SQL Server-instansen App Service pekar mot idag. Del 10 (Blob Storage) och Del 20 (generalisera Key Vault-uppsättningen) följer efter det.</w:t>
+        <w:t xml:space="preserve">Fas 2 är helt klar (se avsnitt 5.1–5.5). Fas 3 — Azure — är i god fart: både Del 8 (se 5.6) och Del 9 (se 5.7) är klara och verifierade mot en skarp prenumeration i Sweden Central — App Service, en lösenordsfri Azure Pipelines-pipeline (Azure DevOps), och nu även en riktig Azure SQL-databas svarar alla som de ska; API:et är funktionellt i molnet, inte bara /health och Swagger. Nästa konkreta steg är Del 10 (Azure Blob Storage) för filuppladdning, och därefter Del 20 (generalisera Key Vault-uppsättningen, byta ut den återanvända SQL-admin-inloggningen mot en snävare).</w:t>
       </w:r>
     </w:p>
     <w:p>

</xml_diff>